<commit_message>
Update live demo links in README and submission Word document
</commit_message>
<xml_diff>
--- a/Darukaa_Earth_Submission.docx
+++ b/Darukaa_Earth_Submission.docx
@@ -56,24 +56,12 @@
     </w:p>
     <w:p>
       <w:r>
-        <w:rPr>
-          <w:b/>
-        </w:rPr>
-        <w:t xml:space="preserve">Frontend (Vercel): </w:t>
-      </w:r>
-      <w:r>
-        <w:t>[INSERT_YOUR_VERCEL_URL_HERE]</w:t>
+        <w:t>Frontend (Vercel): https://darukaa-earth-project.vercel.app</w:t>
       </w:r>
     </w:p>
     <w:p>
       <w:r>
-        <w:rPr>
-          <w:b/>
-        </w:rPr>
-        <w:t xml:space="preserve">Backend API Docs (Render): </w:t>
-      </w:r>
-      <w:r>
-        <w:t>[INSERT_YOUR_RENDER_URL_HERE]/docs</w:t>
+        <w:t>Backend API Docs (Render): https://darukaa-earth-api-hgfz.onrender.com/docs</w:t>
       </w:r>
     </w:p>
     <w:p>

</xml_diff>